<commit_message>
Updated use case scenarios and user stories in order to store add the update content or title scenario
</commit_message>
<xml_diff>
--- a/requirement_analysis_user_stories_use_case/01_UserStories_UseCases.docx
+++ b/requirement_analysis_user_stories_use_case/01_UserStories_UseCases.docx
@@ -763,6 +763,171 @@
     </w:p>
     <w:p>
       <w:pPr>
+        <w:pStyle w:val="Heading2"/>
+        <w:spacing w:after="80" w:before="240"/>
+      </w:pPr>
+      <w:r>
+        <w:rPr>
+          <w:rFonts w:ascii="Arial" w:cs="Arial" w:eastAsia="Arial" w:hAnsi="Arial"/>
+          <w:b/>
+          <w:bCs/>
+          <w:color w:val="2E75B6"/>
+          <w:sz w:val="28"/>
+          <w:szCs w:val="28"/>
+        </w:rPr>
+        <w:t xml:space="preserve">US7 — Update Note</w:t>
+      </w:r>
+    </w:p>
+    <w:p>
+      <w:pPr>
+        <w:spacing w:after="40" w:before="40"/>
+      </w:pPr>
+      <w:r>
+        <w:rPr>
+          <w:rFonts w:ascii="Arial" w:cs="Arial" w:eastAsia="Arial" w:hAnsi="Arial"/>
+          <w:b/>
+          <w:bCs/>
+          <w:sz w:val="22"/>
+          <w:szCs w:val="22"/>
+        </w:rPr>
+        <w:t xml:space="preserve">As a user, I want to edit the title or content of an existing note so that I can keep my information up to date.</w:t>
+      </w:r>
+    </w:p>
+    <w:p>
+      <w:pPr>
+        <w:spacing w:after="60" w:before="60"/>
+      </w:pPr>
+    </w:p>
+    <w:p>
+      <w:pPr>
+        <w:spacing w:after="40" w:before="40"/>
+      </w:pPr>
+      <w:r>
+        <w:rPr>
+          <w:rFonts w:ascii="Arial" w:cs="Arial" w:eastAsia="Arial" w:hAnsi="Arial"/>
+          <w:b/>
+          <w:bCs/>
+          <w:sz w:val="22"/>
+          <w:szCs w:val="22"/>
+        </w:rPr>
+        <w:t xml:space="preserve">Acceptance Criteria:</w:t>
+      </w:r>
+    </w:p>
+    <w:p>
+      <w:pPr>
+        <w:pStyle w:val="ListParagraph"/>
+        <w:numPr>
+          <w:ilvl w:val="0"/>
+          <w:numId w:val="2"/>
+        </w:numPr>
+        <w:spacing w:after="30" w:before="30"/>
+      </w:pPr>
+      <w:r>
+        <w:rPr>
+          <w:rFonts w:ascii="Arial" w:cs="Arial" w:eastAsia="Arial" w:hAnsi="Arial"/>
+          <w:sz w:val="22"/>
+          <w:szCs w:val="22"/>
+        </w:rPr>
+        <w:t xml:space="preserve">User selects an existing note</w:t>
+      </w:r>
+    </w:p>
+    <w:p>
+      <w:pPr>
+        <w:pStyle w:val="ListParagraph"/>
+        <w:numPr>
+          <w:ilvl w:val="0"/>
+          <w:numId w:val="2"/>
+        </w:numPr>
+        <w:spacing w:after="30" w:before="30"/>
+      </w:pPr>
+      <w:r>
+        <w:rPr>
+          <w:rFonts w:ascii="Arial" w:cs="Arial" w:eastAsia="Arial" w:hAnsi="Arial"/>
+          <w:sz w:val="22"/>
+          <w:szCs w:val="22"/>
+        </w:rPr>
+        <w:t xml:space="preserve">User enters the correct password to decrypt the note</w:t>
+      </w:r>
+    </w:p>
+    <w:p>
+      <w:pPr>
+        <w:pStyle w:val="ListParagraph"/>
+        <w:numPr>
+          <w:ilvl w:val="0"/>
+          <w:numId w:val="2"/>
+        </w:numPr>
+        <w:spacing w:after="30" w:before="30"/>
+      </w:pPr>
+      <w:r>
+        <w:rPr>
+          <w:rFonts w:ascii="Arial" w:cs="Arial" w:eastAsia="Arial" w:hAnsi="Arial"/>
+          <w:sz w:val="22"/>
+          <w:szCs w:val="22"/>
+        </w:rPr>
+        <w:t xml:space="preserve">User can modify the title and/or content</w:t>
+      </w:r>
+    </w:p>
+    <w:p>
+      <w:pPr>
+        <w:pStyle w:val="ListParagraph"/>
+        <w:numPr>
+          <w:ilvl w:val="0"/>
+          <w:numId w:val="2"/>
+        </w:numPr>
+        <w:spacing w:after="30" w:before="30"/>
+      </w:pPr>
+      <w:r>
+        <w:rPr>
+          <w:rFonts w:ascii="Arial" w:cs="Arial" w:eastAsia="Arial" w:hAnsi="Arial"/>
+          <w:sz w:val="22"/>
+          <w:szCs w:val="22"/>
+        </w:rPr>
+        <w:t xml:space="preserve">User provides a password to re-encrypt the updated note</w:t>
+      </w:r>
+    </w:p>
+    <w:p>
+      <w:pPr>
+        <w:pStyle w:val="ListParagraph"/>
+        <w:numPr>
+          <w:ilvl w:val="0"/>
+          <w:numId w:val="2"/>
+        </w:numPr>
+        <w:spacing w:after="30" w:before="30"/>
+      </w:pPr>
+      <w:r>
+        <w:rPr>
+          <w:rFonts w:ascii="Arial" w:cs="Arial" w:eastAsia="Arial" w:hAnsi="Arial"/>
+          <w:sz w:val="22"/>
+          <w:szCs w:val="22"/>
+        </w:rPr>
+        <w:t xml:space="preserve">Updated note is re-encrypted and saved in SQLite</w:t>
+      </w:r>
+    </w:p>
+    <w:p>
+      <w:pPr>
+        <w:pStyle w:val="ListParagraph"/>
+        <w:numPr>
+          <w:ilvl w:val="0"/>
+          <w:numId w:val="2"/>
+        </w:numPr>
+        <w:spacing w:after="30" w:before="30"/>
+      </w:pPr>
+      <w:r>
+        <w:rPr>
+          <w:rFonts w:ascii="Arial" w:cs="Arial" w:eastAsia="Arial" w:hAnsi="Arial"/>
+          <w:sz w:val="22"/>
+          <w:szCs w:val="22"/>
+        </w:rPr>
+        <w:t xml:space="preserve">Original encrypted content is replaced</w:t>
+      </w:r>
+    </w:p>
+    <w:p>
+      <w:pPr>
+        <w:spacing w:after="60" w:before="60"/>
+      </w:pPr>
+    </w:p>
+    <w:p>
+      <w:pPr>
         <w:pStyle w:val="Heading1"/>
         <w:pBdr>
           <w:bottom w:val="single" w:color="2E75B6" w:sz="6" w:space="1"/>
@@ -2248,6 +2413,597 @@
           <w:szCs w:val="22"/>
         </w:rPr>
         <w:t xml:space="preserve">Note remains in database</w:t>
+      </w:r>
+    </w:p>
+    <w:p>
+      <w:pPr>
+        <w:spacing w:after="60" w:before="60"/>
+      </w:pPr>
+    </w:p>
+    <w:p>
+      <w:pPr>
+        <w:pStyle w:val="Heading2"/>
+        <w:spacing w:after="80" w:before="240"/>
+      </w:pPr>
+      <w:r>
+        <w:rPr>
+          <w:rFonts w:ascii="Arial" w:cs="Arial" w:eastAsia="Arial" w:hAnsi="Arial"/>
+          <w:b/>
+          <w:bCs/>
+          <w:color w:val="2E75B6"/>
+          <w:sz w:val="28"/>
+          <w:szCs w:val="28"/>
+        </w:rPr>
+        <w:t xml:space="preserve">UC6 — Update Note</w:t>
+      </w:r>
+    </w:p>
+    <w:p>
+      <w:pPr>
+        <w:spacing w:after="30" w:before="30"/>
+      </w:pPr>
+      <w:r>
+        <w:rPr>
+          <w:rFonts w:ascii="Arial" w:cs="Arial" w:eastAsia="Arial" w:hAnsi="Arial"/>
+          <w:b/>
+          <w:bCs/>
+          <w:sz w:val="22"/>
+          <w:szCs w:val="22"/>
+        </w:rPr>
+        <w:t xml:space="preserve">Actor: </w:t>
+      </w:r>
+      <w:r>
+        <w:rPr>
+          <w:rFonts w:ascii="Arial" w:cs="Arial" w:eastAsia="Arial" w:hAnsi="Arial"/>
+          <w:sz w:val="22"/>
+          <w:szCs w:val="22"/>
+        </w:rPr>
+        <w:t xml:space="preserve">User</w:t>
+      </w:r>
+    </w:p>
+    <w:p>
+      <w:pPr>
+        <w:spacing w:after="30" w:before="30"/>
+      </w:pPr>
+      <w:r>
+        <w:rPr>
+          <w:rFonts w:ascii="Arial" w:cs="Arial" w:eastAsia="Arial" w:hAnsi="Arial"/>
+          <w:b/>
+          <w:bCs/>
+          <w:sz w:val="22"/>
+          <w:szCs w:val="22"/>
+        </w:rPr>
+        <w:t xml:space="preserve">Precondition: </w:t>
+      </w:r>
+      <w:r>
+        <w:rPr>
+          <w:rFonts w:ascii="Arial" w:cs="Arial" w:eastAsia="Arial" w:hAnsi="Arial"/>
+          <w:sz w:val="22"/>
+          <w:szCs w:val="22"/>
+        </w:rPr>
+        <w:t xml:space="preserve">At least one encrypted note exists</w:t>
+      </w:r>
+    </w:p>
+    <w:p>
+      <w:pPr>
+        <w:spacing w:after="60" w:before="60"/>
+      </w:pPr>
+    </w:p>
+    <w:p>
+      <w:pPr>
+        <w:spacing w:after="40" w:before="40"/>
+      </w:pPr>
+      <w:r>
+        <w:rPr>
+          <w:rFonts w:ascii="Arial" w:cs="Arial" w:eastAsia="Arial" w:hAnsi="Arial"/>
+          <w:b/>
+          <w:bCs/>
+          <w:sz w:val="22"/>
+          <w:szCs w:val="22"/>
+        </w:rPr>
+        <w:t xml:space="preserve">Main Flow:</w:t>
+      </w:r>
+    </w:p>
+    <w:p>
+      <w:pPr>
+        <w:pStyle w:val="ListParagraph"/>
+        <w:numPr>
+          <w:ilvl w:val="0"/>
+          <w:numId w:val="7"/>
+        </w:numPr>
+        <w:spacing w:after="30" w:before="30"/>
+      </w:pPr>
+      <w:r>
+        <w:rPr>
+          <w:rFonts w:ascii="Arial" w:cs="Arial" w:eastAsia="Arial" w:hAnsi="Arial"/>
+          <w:sz w:val="22"/>
+          <w:szCs w:val="22"/>
+        </w:rPr>
+        <w:t xml:space="preserve">User selects an existing note from the list</w:t>
+      </w:r>
+    </w:p>
+    <w:p>
+      <w:pPr>
+        <w:pStyle w:val="ListParagraph"/>
+        <w:numPr>
+          <w:ilvl w:val="0"/>
+          <w:numId w:val="7"/>
+        </w:numPr>
+        <w:spacing w:after="30" w:before="30"/>
+      </w:pPr>
+      <w:r>
+        <w:rPr>
+          <w:rFonts w:ascii="Arial" w:cs="Arial" w:eastAsia="Arial" w:hAnsi="Arial"/>
+          <w:sz w:val="22"/>
+          <w:szCs w:val="22"/>
+        </w:rPr>
+        <w:t xml:space="preserve">System prompts for password</w:t>
+      </w:r>
+    </w:p>
+    <w:p>
+      <w:pPr>
+        <w:pStyle w:val="ListParagraph"/>
+        <w:numPr>
+          <w:ilvl w:val="0"/>
+          <w:numId w:val="7"/>
+        </w:numPr>
+        <w:spacing w:after="30" w:before="30"/>
+      </w:pPr>
+      <w:r>
+        <w:rPr>
+          <w:rFonts w:ascii="Arial" w:cs="Arial" w:eastAsia="Arial" w:hAnsi="Arial"/>
+          <w:sz w:val="22"/>
+          <w:szCs w:val="22"/>
+        </w:rPr>
+        <w:t xml:space="preserve">User enters password</w:t>
+      </w:r>
+    </w:p>
+    <w:p>
+      <w:pPr>
+        <w:pStyle w:val="ListParagraph"/>
+        <w:numPr>
+          <w:ilvl w:val="0"/>
+          <w:numId w:val="7"/>
+        </w:numPr>
+        <w:spacing w:after="30" w:before="30"/>
+      </w:pPr>
+      <w:r>
+        <w:rPr>
+          <w:rFonts w:ascii="Arial" w:cs="Arial" w:eastAsia="Arial" w:hAnsi="Arial"/>
+          <w:sz w:val="22"/>
+          <w:szCs w:val="22"/>
+        </w:rPr>
+        <w:t xml:space="preserve">System decrypts the note content for editing</w:t>
+      </w:r>
+    </w:p>
+    <w:p>
+      <w:pPr>
+        <w:pStyle w:val="ListParagraph"/>
+        <w:numPr>
+          <w:ilvl w:val="0"/>
+          <w:numId w:val="7"/>
+        </w:numPr>
+        <w:spacing w:after="30" w:before="30"/>
+      </w:pPr>
+      <w:r>
+        <w:rPr>
+          <w:rFonts w:ascii="Arial" w:cs="Arial" w:eastAsia="Arial" w:hAnsi="Arial"/>
+          <w:sz w:val="22"/>
+          <w:szCs w:val="22"/>
+        </w:rPr>
+        <w:t xml:space="preserve">User modifies the title and/or content</w:t>
+      </w:r>
+    </w:p>
+    <w:p>
+      <w:pPr>
+        <w:pStyle w:val="ListParagraph"/>
+        <w:numPr>
+          <w:ilvl w:val="0"/>
+          <w:numId w:val="7"/>
+        </w:numPr>
+        <w:spacing w:after="30" w:before="30"/>
+      </w:pPr>
+      <w:r>
+        <w:rPr>
+          <w:rFonts w:ascii="Arial" w:cs="Arial" w:eastAsia="Arial" w:hAnsi="Arial"/>
+          <w:sz w:val="22"/>
+          <w:szCs w:val="22"/>
+        </w:rPr>
+        <w:t xml:space="preserve">User provides password to re-encrypt</w:t>
+      </w:r>
+    </w:p>
+    <w:p>
+      <w:pPr>
+        <w:pStyle w:val="ListParagraph"/>
+        <w:numPr>
+          <w:ilvl w:val="0"/>
+          <w:numId w:val="7"/>
+        </w:numPr>
+        <w:spacing w:after="30" w:before="30"/>
+      </w:pPr>
+      <w:r>
+        <w:rPr>
+          <w:rFonts w:ascii="Arial" w:cs="Arial" w:eastAsia="Arial" w:hAnsi="Arial"/>
+          <w:sz w:val="22"/>
+          <w:szCs w:val="22"/>
+        </w:rPr>
+        <w:t xml:space="preserve">System generates new salt and IV</w:t>
+      </w:r>
+    </w:p>
+    <w:p>
+      <w:pPr>
+        <w:pStyle w:val="ListParagraph"/>
+        <w:numPr>
+          <w:ilvl w:val="0"/>
+          <w:numId w:val="7"/>
+        </w:numPr>
+        <w:spacing w:after="30" w:before="30"/>
+      </w:pPr>
+      <w:r>
+        <w:rPr>
+          <w:rFonts w:ascii="Arial" w:cs="Arial" w:eastAsia="Arial" w:hAnsi="Arial"/>
+          <w:sz w:val="22"/>
+          <w:szCs w:val="22"/>
+        </w:rPr>
+        <w:t xml:space="preserve">System re-encrypts updated content using AES</w:t>
+      </w:r>
+    </w:p>
+    <w:p>
+      <w:pPr>
+        <w:pStyle w:val="ListParagraph"/>
+        <w:numPr>
+          <w:ilvl w:val="0"/>
+          <w:numId w:val="7"/>
+        </w:numPr>
+        <w:spacing w:after="30" w:before="30"/>
+      </w:pPr>
+      <w:r>
+        <w:rPr>
+          <w:rFonts w:ascii="Arial" w:cs="Arial" w:eastAsia="Arial" w:hAnsi="Arial"/>
+          <w:sz w:val="22"/>
+          <w:szCs w:val="22"/>
+        </w:rPr>
+        <w:t xml:space="preserve">Updated encrypted note is saved in SQLite, replacing the original</w:t>
+      </w:r>
+    </w:p>
+    <w:p>
+      <w:pPr>
+        <w:pStyle w:val="ListParagraph"/>
+        <w:numPr>
+          <w:ilvl w:val="0"/>
+          <w:numId w:val="7"/>
+        </w:numPr>
+        <w:spacing w:after="30" w:before="30"/>
+      </w:pPr>
+      <w:r>
+        <w:rPr>
+          <w:rFonts w:ascii="Arial" w:cs="Arial" w:eastAsia="Arial" w:hAnsi="Arial"/>
+          <w:sz w:val="22"/>
+          <w:szCs w:val="22"/>
+        </w:rPr>
+        <w:t xml:space="preserve">UI reflects the updated note title in the list</w:t>
+      </w:r>
+    </w:p>
+    <w:p>
+      <w:pPr>
+        <w:spacing w:after="30" w:before="30"/>
+      </w:pPr>
+      <w:r>
+        <w:rPr>
+          <w:rFonts w:ascii="Arial" w:cs="Arial" w:eastAsia="Arial" w:hAnsi="Arial"/>
+          <w:b/>
+          <w:bCs/>
+          <w:sz w:val="22"/>
+          <w:szCs w:val="22"/>
+        </w:rPr>
+        <w:t xml:space="preserve">Postcondition: </w:t>
+      </w:r>
+      <w:r>
+        <w:rPr>
+          <w:rFonts w:ascii="Arial" w:cs="Arial" w:eastAsia="Arial" w:hAnsi="Arial"/>
+          <w:sz w:val="22"/>
+          <w:szCs w:val="22"/>
+        </w:rPr>
+        <w:t xml:space="preserve">Updated note is encrypted and saved; original content is replaced</w:t>
+      </w:r>
+    </w:p>
+    <w:p>
+      <w:pPr>
+        <w:spacing w:after="60" w:before="60"/>
+      </w:pPr>
+    </w:p>
+    <w:p>
+      <w:pPr>
+        <w:spacing w:after="40" w:before="40"/>
+      </w:pPr>
+      <w:r>
+        <w:rPr>
+          <w:rFonts w:ascii="Arial" w:cs="Arial" w:eastAsia="Arial" w:hAnsi="Arial"/>
+          <w:b/>
+          <w:bCs/>
+          <w:sz w:val="22"/>
+          <w:szCs w:val="22"/>
+        </w:rPr>
+        <w:t xml:space="preserve">Alternative Flows:</w:t>
+      </w:r>
+    </w:p>
+    <w:p>
+      <w:pPr>
+        <w:spacing w:after="60" w:before="200"/>
+      </w:pPr>
+      <w:r>
+        <w:rPr>
+          <w:rFonts w:ascii="Arial" w:cs="Arial" w:eastAsia="Arial" w:hAnsi="Arial"/>
+          <w:b/>
+          <w:bCs/>
+          <w:color w:val="2F5496"/>
+          <w:sz w:val="24"/>
+          <w:szCs w:val="24"/>
+        </w:rPr>
+        <w:t xml:space="preserve">AF1 — Wrong password on decrypt</w:t>
+      </w:r>
+    </w:p>
+    <w:p>
+      <w:pPr>
+        <w:pStyle w:val="ListParagraph"/>
+        <w:numPr>
+          <w:ilvl w:val="0"/>
+          <w:numId w:val="2"/>
+        </w:numPr>
+        <w:spacing w:after="30" w:before="30"/>
+      </w:pPr>
+      <w:r>
+        <w:rPr>
+          <w:rFonts w:ascii="Arial" w:cs="Arial" w:eastAsia="Arial" w:hAnsi="Arial"/>
+          <w:sz w:val="22"/>
+          <w:szCs w:val="22"/>
+        </w:rPr>
+        <w:t xml:space="preserve">Decryption fails</w:t>
+      </w:r>
+    </w:p>
+    <w:p>
+      <w:pPr>
+        <w:pStyle w:val="ListParagraph"/>
+        <w:numPr>
+          <w:ilvl w:val="0"/>
+          <w:numId w:val="2"/>
+        </w:numPr>
+        <w:spacing w:after="30" w:before="30"/>
+      </w:pPr>
+      <w:r>
+        <w:rPr>
+          <w:rFonts w:ascii="Arial" w:cs="Arial" w:eastAsia="Arial" w:hAnsi="Arial"/>
+          <w:sz w:val="22"/>
+          <w:szCs w:val="22"/>
+        </w:rPr>
+        <w:t xml:space="preserve">System shows "Incorrect password"</w:t>
+      </w:r>
+    </w:p>
+    <w:p>
+      <w:pPr>
+        <w:pStyle w:val="ListParagraph"/>
+        <w:numPr>
+          <w:ilvl w:val="0"/>
+          <w:numId w:val="2"/>
+        </w:numPr>
+        <w:spacing w:after="30" w:before="30"/>
+      </w:pPr>
+      <w:r>
+        <w:rPr>
+          <w:rFonts w:ascii="Arial" w:cs="Arial" w:eastAsia="Arial" w:hAnsi="Arial"/>
+          <w:sz w:val="22"/>
+          <w:szCs w:val="22"/>
+        </w:rPr>
+        <w:t xml:space="preserve">Edit mode is not entered</w:t>
+      </w:r>
+    </w:p>
+    <w:p>
+      <w:pPr>
+        <w:spacing w:after="60" w:before="200"/>
+      </w:pPr>
+      <w:r>
+        <w:rPr>
+          <w:rFonts w:ascii="Arial" w:cs="Arial" w:eastAsia="Arial" w:hAnsi="Arial"/>
+          <w:b/>
+          <w:bCs/>
+          <w:color w:val="2F5496"/>
+          <w:sz w:val="24"/>
+          <w:szCs w:val="24"/>
+        </w:rPr>
+        <w:t xml:space="preserve">AF2 — Wrong password on re-encrypt</w:t>
+      </w:r>
+    </w:p>
+    <w:p>
+      <w:pPr>
+        <w:pStyle w:val="ListParagraph"/>
+        <w:numPr>
+          <w:ilvl w:val="0"/>
+          <w:numId w:val="2"/>
+        </w:numPr>
+        <w:spacing w:after="30" w:before="30"/>
+      </w:pPr>
+      <w:r>
+        <w:rPr>
+          <w:rFonts w:ascii="Arial" w:cs="Arial" w:eastAsia="Arial" w:hAnsi="Arial"/>
+          <w:sz w:val="22"/>
+          <w:szCs w:val="22"/>
+        </w:rPr>
+        <w:t xml:space="preserve">User mistypes password on save</w:t>
+      </w:r>
+    </w:p>
+    <w:p>
+      <w:pPr>
+        <w:pStyle w:val="ListParagraph"/>
+        <w:numPr>
+          <w:ilvl w:val="0"/>
+          <w:numId w:val="2"/>
+        </w:numPr>
+        <w:spacing w:after="30" w:before="30"/>
+      </w:pPr>
+      <w:r>
+        <w:rPr>
+          <w:rFonts w:ascii="Arial" w:cs="Arial" w:eastAsia="Arial" w:hAnsi="Arial"/>
+          <w:sz w:val="22"/>
+          <w:szCs w:val="22"/>
+        </w:rPr>
+        <w:t xml:space="preserve">Note is not saved</w:t>
+      </w:r>
+    </w:p>
+    <w:p>
+      <w:pPr>
+        <w:pStyle w:val="ListParagraph"/>
+        <w:numPr>
+          <w:ilvl w:val="0"/>
+          <w:numId w:val="2"/>
+        </w:numPr>
+        <w:spacing w:after="30" w:before="30"/>
+      </w:pPr>
+      <w:r>
+        <w:rPr>
+          <w:rFonts w:ascii="Arial" w:cs="Arial" w:eastAsia="Arial" w:hAnsi="Arial"/>
+          <w:sz w:val="22"/>
+          <w:szCs w:val="22"/>
+        </w:rPr>
+        <w:t xml:space="preserve">System shows error message</w:t>
+      </w:r>
+    </w:p>
+    <w:p>
+      <w:pPr>
+        <w:pStyle w:val="ListParagraph"/>
+        <w:numPr>
+          <w:ilvl w:val="0"/>
+          <w:numId w:val="2"/>
+        </w:numPr>
+        <w:spacing w:after="30" w:before="30"/>
+      </w:pPr>
+      <w:r>
+        <w:rPr>
+          <w:rFonts w:ascii="Arial" w:cs="Arial" w:eastAsia="Arial" w:hAnsi="Arial"/>
+          <w:sz w:val="22"/>
+          <w:szCs w:val="22"/>
+        </w:rPr>
+        <w:t xml:space="preserve">User must retry</w:t>
+      </w:r>
+    </w:p>
+    <w:p>
+      <w:pPr>
+        <w:spacing w:after="60" w:before="200"/>
+      </w:pPr>
+      <w:r>
+        <w:rPr>
+          <w:rFonts w:ascii="Arial" w:cs="Arial" w:eastAsia="Arial" w:hAnsi="Arial"/>
+          <w:b/>
+          <w:bCs/>
+          <w:color w:val="2F5496"/>
+          <w:sz w:val="24"/>
+          <w:szCs w:val="24"/>
+        </w:rPr>
+        <w:t xml:space="preserve">AF3 — No changes made</w:t>
+      </w:r>
+    </w:p>
+    <w:p>
+      <w:pPr>
+        <w:pStyle w:val="ListParagraph"/>
+        <w:numPr>
+          <w:ilvl w:val="0"/>
+          <w:numId w:val="2"/>
+        </w:numPr>
+        <w:spacing w:after="30" w:before="30"/>
+      </w:pPr>
+      <w:r>
+        <w:rPr>
+          <w:rFonts w:ascii="Arial" w:cs="Arial" w:eastAsia="Arial" w:hAnsi="Arial"/>
+          <w:sz w:val="22"/>
+          <w:szCs w:val="22"/>
+        </w:rPr>
+        <w:t xml:space="preserve">User opens note but makes no edits</w:t>
+      </w:r>
+    </w:p>
+    <w:p>
+      <w:pPr>
+        <w:pStyle w:val="ListParagraph"/>
+        <w:numPr>
+          <w:ilvl w:val="0"/>
+          <w:numId w:val="2"/>
+        </w:numPr>
+        <w:spacing w:after="30" w:before="30"/>
+      </w:pPr>
+      <w:r>
+        <w:rPr>
+          <w:rFonts w:ascii="Arial" w:cs="Arial" w:eastAsia="Arial" w:hAnsi="Arial"/>
+          <w:sz w:val="22"/>
+          <w:szCs w:val="22"/>
+        </w:rPr>
+        <w:t xml:space="preserve">System saves the re-encrypted note unchanged</w:t>
+      </w:r>
+    </w:p>
+    <w:p>
+      <w:pPr>
+        <w:spacing w:after="60" w:before="200"/>
+      </w:pPr>
+      <w:r>
+        <w:rPr>
+          <w:rFonts w:ascii="Arial" w:cs="Arial" w:eastAsia="Arial" w:hAnsi="Arial"/>
+          <w:b/>
+          <w:bCs/>
+          <w:color w:val="2F5496"/>
+          <w:sz w:val="24"/>
+          <w:szCs w:val="24"/>
+        </w:rPr>
+        <w:t xml:space="preserve">AF4 — Database failure on save</w:t>
+      </w:r>
+    </w:p>
+    <w:p>
+      <w:pPr>
+        <w:pStyle w:val="ListParagraph"/>
+        <w:numPr>
+          <w:ilvl w:val="0"/>
+          <w:numId w:val="2"/>
+        </w:numPr>
+        <w:spacing w:after="30" w:before="30"/>
+      </w:pPr>
+      <w:r>
+        <w:rPr>
+          <w:rFonts w:ascii="Arial" w:cs="Arial" w:eastAsia="Arial" w:hAnsi="Arial"/>
+          <w:sz w:val="22"/>
+          <w:szCs w:val="22"/>
+        </w:rPr>
+        <w:t xml:space="preserve">Update operation fails</w:t>
+      </w:r>
+    </w:p>
+    <w:p>
+      <w:pPr>
+        <w:pStyle w:val="ListParagraph"/>
+        <w:numPr>
+          <w:ilvl w:val="0"/>
+          <w:numId w:val="2"/>
+        </w:numPr>
+        <w:spacing w:after="30" w:before="30"/>
+      </w:pPr>
+      <w:r>
+        <w:rPr>
+          <w:rFonts w:ascii="Arial" w:cs="Arial" w:eastAsia="Arial" w:hAnsi="Arial"/>
+          <w:sz w:val="22"/>
+          <w:szCs w:val="22"/>
+        </w:rPr>
+        <w:t xml:space="preserve">System shows error message</w:t>
+      </w:r>
+    </w:p>
+    <w:p>
+      <w:pPr>
+        <w:pStyle w:val="ListParagraph"/>
+        <w:numPr>
+          <w:ilvl w:val="0"/>
+          <w:numId w:val="2"/>
+        </w:numPr>
+        <w:spacing w:after="30" w:before="30"/>
+      </w:pPr>
+      <w:r>
+        <w:rPr>
+          <w:rFonts w:ascii="Arial" w:cs="Arial" w:eastAsia="Arial" w:hAnsi="Arial"/>
+          <w:sz w:val="22"/>
+          <w:szCs w:val="22"/>
+        </w:rPr>
+        <w:t xml:space="preserve">Original note remains unchanged in SQLite</w:t>
       </w:r>
     </w:p>
     <w:p>
@@ -2737,6 +3493,18 @@
     </w:lvl>
   </w:abstractNum>
   <w:abstractNum w:abstractNumId="6" w15:restartNumberingAfterBreak="0">
+    <w:multiLevelType w:val="hybridMultilevel"/>
+    <w:lvl w:ilvl="0" w15:tentative="1">
+      <w:start w:val="1"/>
+      <w:numFmt w:val="decimal"/>
+      <w:lvlText w:val="%1."/>
+      <w:lvlJc w:val="left"/>
+      <w:pPr>
+        <w:ind w:left="720" w:hanging="360"/>
+      </w:pPr>
+    </w:lvl>
+  </w:abstractNum>
+  <w:abstractNum w:abstractNumId="7" w15:restartNumberingAfterBreak="0">
     <w:multiLevelType w:val="hybridMultilevel"/>
     <w:lvl w:ilvl="0" w15:tentative="1">
       <w:start w:val="1"/>
@@ -2780,6 +3548,12 @@
   </w:num>
   <w:num w:numId="6">
     <w:abstractNumId w:val="6"/>
+    <w:lvlOverride w:ilvl="0">
+      <w:startOverride w:val="1"/>
+    </w:lvlOverride>
+  </w:num>
+  <w:num w:numId="7">
+    <w:abstractNumId w:val="7"/>
     <w:lvlOverride w:ilvl="0">
       <w:startOverride w:val="1"/>
     </w:lvlOverride>

</xml_diff>